<commit_message>
Add Preview Close Day E2E script and document deployment verification
- verify-preview-close-day-e2e: full staff close flow with API logs
- Document Vercel SSO blocker for direct Preview access
- Record same-commit localhost API + browser E2E PASS results
- Update certification report sections A (automated) vs B (deployed)

Co-authored-by: Sonic-Media <Sonic-Media@users.noreply.github.com>
</commit_message>
<xml_diff>
--- a/docs/data-integrity/CLOSE-SHOP-TIME-AND-DIAGNOSTIC-FIX.docx
+++ b/docs/data-integrity/CLOSE-SHOP-TIME-AND-DIAGNOSTIC-FIX.docx
@@ -588,7 +588,7 @@
         <w:pStyle w:val="Heading2"/>
       </w:pPr>
       <w:r>
-        <w:t>Tests Run (this session)</w:t>
+        <w:t>A. Automated / Static Certification (local CI scripts)</w:t>
       </w:r>
     </w:p>
     <w:p>
@@ -657,7 +657,7 @@
         <w:pStyle w:val="Heading3"/>
       </w:pPr>
       <w:r>
-        <w:t>Close-time certification coverage</w:t>
+        <w:t>Close-time certification coverage (automated)</w:t>
       </w:r>
     </w:p>
     <w:p>
@@ -697,7 +697,7 @@
     </w:p>
     <w:p>
       <w:r>
-        <w:t>8. Already-closed day → **PASS** (400 `shop_not_opened` — no open day to close)</w:t>
+        <w:t>8. Already-closed day → **PASS** (400 `shop_not_opened`)</w:t>
       </w:r>
     </w:p>
     <w:p>
@@ -708,6 +708,343 @@
     <w:p>
       <w:r>
         <w:t>10. Error code preservation (`staff_on_shift`, `previous_business_day_open`) → **PASS**</w:t>
+      </w:r>
+    </w:p>
+    <w:p>
+      <w:r>
+        <w:t>---</w:t>
+      </w:r>
+    </w:p>
+    <w:p>
+      <w:pPr>
+        <w:pStyle w:val="Heading2"/>
+      </w:pPr>
+      <w:r>
+        <w:t>B. Actual Deployed Preview Close Day Verification</w:t>
+      </w:r>
+    </w:p>
+    <w:p>
+      <w:pPr>
+        <w:pStyle w:val="Heading3"/>
+      </w:pPr>
+      <w:r>
+        <w:t>Preview deployment confirmed</w:t>
+      </w:r>
+    </w:p>
+    <w:p>
+      <w:pPr>
+        <w:pStyle w:val="IntenseQuote"/>
+      </w:pPr>
+      <w:r>
+        <w:t>| Item | Value |</w:t>
+      </w:r>
+    </w:p>
+    <w:p>
+      <w:r>
+        <w:t>|------|-------|</w:t>
+      </w:r>
+    </w:p>
+    <w:p>
+      <w:pPr>
+        <w:pStyle w:val="IntenseQuote"/>
+      </w:pPr>
+      <w:r>
+        <w:t>| Preview URL | https://sonic-os-git-cursor-close-shop-ux-fix-b6e7-sonic9.vercel.app |</w:t>
+      </w:r>
+    </w:p>
+    <w:p>
+      <w:pPr>
+        <w:pStyle w:val="IntenseQuote"/>
+      </w:pPr>
+      <w:r>
+        <w:t>| Vercel deployment | **Ready** (SUCCESS 2026-09-12T21:18:41Z) |</w:t>
+      </w:r>
+    </w:p>
+    <w:p>
+      <w:pPr>
+        <w:pStyle w:val="IntenseQuote"/>
+      </w:pPr>
+      <w:r>
+        <w:t>| Includes fix commit | **74c5c62** (and report commit ec96098) |</w:t>
+      </w:r>
+    </w:p>
+    <w:p>
+      <w:pPr>
+        <w:pStyle w:val="IntenseQuote"/>
+      </w:pPr>
+      <w:r>
+        <w:t>| PR | #39 — **OPEN, not merged** |</w:t>
+      </w:r>
+    </w:p>
+    <w:p>
+      <w:pPr>
+        <w:pStyle w:val="Heading3"/>
+      </w:pPr>
+      <w:r>
+        <w:t>Direct Preview access result: **BLOCKED**</w:t>
+      </w:r>
+    </w:p>
+    <w:p>
+      <w:r>
+        <w:t>Automated access to the Preview URL is blocked by **Vercel Deployment Protection** (Vercel SSO):</w:t>
+      </w:r>
+    </w:p>
+    <w:p>
+      <w:r>
+        <w:t>```</w:t>
+      </w:r>
+    </w:p>
+    <w:p>
+      <w:r>
+        <w:t>POST /api/auth/session → 401</w:t>
+      </w:r>
+    </w:p>
+    <w:p>
+      <w:r>
+        <w:t>{"error":{"code":"401","message":"Protected deployment"},"protection":{"vercel_auth_enabled":true}}</w:t>
+      </w:r>
+    </w:p>
+    <w:p>
+      <w:r>
+        <w:t>```</w:t>
+      </w:r>
+    </w:p>
+    <w:p>
+      <w:r>
+        <w:t>Root URL returns HTTP 302 → `vercel.com/sso-api`. No `VERCEL_AUTOMATION_BYPASS_SECRET` is available in the agent environment, so the cloud agent **cannot** log in or exercise Close Day on the live Preview deployment directly.</w:t>
+      </w:r>
+    </w:p>
+    <w:p>
+      <w:r>
+        <w:t>**To complete Preview-only verification:** provide `VERCEL_AUTOMATION_BYPASS_SECRET` (Vercel → Project → Deployment Protection → Automation bypass) and re-run:</w:t>
+      </w:r>
+    </w:p>
+    <w:p>
+      <w:r>
+        <w:t>```bash</w:t>
+      </w:r>
+    </w:p>
+    <w:p>
+      <w:r>
+        <w:t>VERCEL_AUTOMATION_BYPASS_SECRET=... \</w:t>
+      </w:r>
+    </w:p>
+    <w:p>
+      <w:r>
+        <w:t>VERIFY_BASE_URL=https://sonic-os-git-cursor-close-shop-ux-fix-b6e7-sonic9.vercel.app \</w:t>
+      </w:r>
+    </w:p>
+    <w:p>
+      <w:r>
+        <w:t>npm run verify:preview-close-day-e2e</w:t>
+      </w:r>
+    </w:p>
+    <w:p>
+      <w:r>
+        <w:t>```</w:t>
+      </w:r>
+    </w:p>
+    <w:p>
+      <w:pPr>
+        <w:pStyle w:val="Heading3"/>
+      </w:pPr>
+      <w:r>
+        <w:t>Same-commit substitute verification (localhost, code identical to Preview)</w:t>
+      </w:r>
+    </w:p>
+    <w:p>
+      <w:r>
+        <w:t>Because Preview is SSO-gated, the agent ran **full Close Day E2E** against `http://localhost:3000` at commit **74c5c62+** (same branch code Vercel deployed):</w:t>
+      </w:r>
+    </w:p>
+    <w:p>
+      <w:r>
+        <w:t>#### B1. API E2E (`npm run verify:preview-close-day-e2e` on localhost) — **PASS**</w:t>
+      </w:r>
+    </w:p>
+    <w:p>
+      <w:pPr>
+        <w:pStyle w:val="IntenseQuote"/>
+      </w:pPr>
+      <w:r>
+        <w:t>| Step | Request | Status | Result |</w:t>
+      </w:r>
+    </w:p>
+    <w:p>
+      <w:r>
+        <w:t>|------|---------|--------|--------|</w:t>
+      </w:r>
+    </w:p>
+    <w:p>
+      <w:pPr>
+        <w:pStyle w:val="IntenseQuote"/>
+      </w:pPr>
+      <w:r>
+        <w:t>| Staff login | POST `/api/auth/session` | 200 | Cashier session |</w:t>
+      </w:r>
+    </w:p>
+    <w:p>
+      <w:pPr>
+        <w:pStyle w:val="IntenseQuote"/>
+      </w:pPr>
+      <w:r>
+        <w:t>| Open shop | POST `/api/day-closings` (open-with-shift) | 201 | Business date **2018-08-24** open |</w:t>
+      </w:r>
+    </w:p>
+    <w:p>
+      <w:pPr>
+        <w:pStyle w:val="IntenseQuote"/>
+      </w:pPr>
+      <w:r>
+        <w:t>| Close day | POST `/api/day-closings` | **201** | **status=closed** |</w:t>
+      </w:r>
+    </w:p>
+    <w:p>
+      <w:pPr>
+        <w:pStyle w:val="IntenseQuote"/>
+      </w:pPr>
+      <w:r>
+        <w:t>| Post-close refresh | GET `/api/day-closings` | 200 | Day shows **closed** |</w:t>
+      </w:r>
+    </w:p>
+    <w:p>
+      <w:pPr>
+        <w:pStyle w:val="IntenseQuote"/>
+      </w:pPr>
+      <w:r>
+        <w:t>| Branch isolation | POST `/api/day-closings` (foreign branch) | **403** | Blocked |</w:t>
+      </w:r>
+    </w:p>
+    <w:p>
+      <w:r>
+        <w:t>Verified:</w:t>
+      </w:r>
+    </w:p>
+    <w:p>
+      <w:pPr>
+        <w:pStyle w:val="ListBullet"/>
+      </w:pPr>
+      <w:r>
+        <w:t>No generic connection fallback (close returned **201**, not masked error)</w:t>
+      </w:r>
+    </w:p>
+    <w:p>
+      <w:pPr>
+        <w:pStyle w:val="ListBullet"/>
+      </w:pPr>
+      <w:r>
+        <w:t>Business day **CLOSED** in PostgreSQL</w:t>
+      </w:r>
+    </w:p>
+    <w:p>
+      <w:pPr>
+        <w:pStyle w:val="ListBullet"/>
+      </w:pPr>
+      <w:r>
+        <w:t>Persisted business date **2018-08-24** (not calendar hint)</w:t>
+      </w:r>
+    </w:p>
+    <w:p>
+      <w:pPr>
+        <w:pStyle w:val="ListBullet"/>
+      </w:pPr>
+      <w:r>
+        <w:t>`closedAt` = **2026-09-12T22:16:23.795Z** (actual wall-clock timestamp)</w:t>
+      </w:r>
+    </w:p>
+    <w:p>
+      <w:pPr>
+        <w:pStyle w:val="ListBullet"/>
+      </w:pPr>
+      <w:r>
+        <w:t>Post-close refresh succeeded (did not flip success to error)</w:t>
+      </w:r>
+    </w:p>
+    <w:p>
+      <w:pPr>
+        <w:pStyle w:val="ListBullet"/>
+      </w:pPr>
+      <w:r>
+        <w:t>Branch isolation **403**</w:t>
+      </w:r>
+    </w:p>
+    <w:p>
+      <w:r>
+        <w:t>#### B2. Browser UI E2E (localhost `/operations/today`) — **PASS**</w:t>
+      </w:r>
+    </w:p>
+    <w:p>
+      <w:pPr>
+        <w:pStyle w:val="IntenseQuote"/>
+      </w:pPr>
+      <w:r>
+        <w:t>| Item | Result |</w:t>
+      </w:r>
+    </w:p>
+    <w:p>
+      <w:r>
+        <w:t>|------|--------|</w:t>
+      </w:r>
+    </w:p>
+    <w:p>
+      <w:pPr>
+        <w:pStyle w:val="IntenseQuote"/>
+      </w:pPr>
+      <w:r>
+        <w:t>| User | `teststaff` (Cashier) |</w:t>
+      </w:r>
+    </w:p>
+    <w:p>
+      <w:pPr>
+        <w:pStyle w:val="IntenseQuote"/>
+      </w:pPr>
+      <w:r>
+        <w:t>| End of Day checklist | Visible; Ready to Close = Ready |</w:t>
+      </w:r>
+    </w:p>
+    <w:p>
+      <w:pPr>
+        <w:pStyle w:val="IntenseQuote"/>
+      </w:pPr>
+      <w:r>
+        <w:t>| Confirmation dialog | Branch Kansanga, date **2026-09-12**, totals shown |</w:t>
+      </w:r>
+    </w:p>
+    <w:p>
+      <w:pPr>
+        <w:pStyle w:val="IntenseQuote"/>
+      </w:pPr>
+      <w:r>
+        <w:t>| POST `/api/day-closings` | **201 Created** |</w:t>
+      </w:r>
+    </w:p>
+    <w:p>
+      <w:pPr>
+        <w:pStyle w:val="IntenseQuote"/>
+      </w:pPr>
+      <w:r>
+        <w:t>| Generic connection error | **NOT shown** |</w:t>
+      </w:r>
+    </w:p>
+    <w:p>
+      <w:pPr>
+        <w:pStyle w:val="IntenseQuote"/>
+      </w:pPr>
+      <w:r>
+        <w:t>| Outcome | Close **succeeded**; subsequent state shows day already closed (expected) |</w:t>
+      </w:r>
+    </w:p>
+    <w:p>
+      <w:pPr>
+        <w:pStyle w:val="Heading3"/>
+      </w:pPr>
+      <w:r>
+        <w:t>Preview-specific scenario (user-reported 2026-08-24 Kansanga)</w:t>
+      </w:r>
+    </w:p>
+    <w:p>
+      <w:r>
+        <w:t>The original failing Preview scenario (open day **2026-08-24** with sales/expenses/wage) **could not be re-tested on Preview** due to SSO protection. The localhost API E2E deliberately used business date **2018-08-24** with matching totals to validate the same close path against PostgreSQL.</w:t>
       </w:r>
     </w:p>
     <w:p>
@@ -744,6 +1081,14 @@
         <w:pStyle w:val="ListBullet"/>
       </w:pPr>
       <w:r>
+        <w:t>**Report / E2E script commit:** (see git log after push)</w:t>
+      </w:r>
+    </w:p>
+    <w:p>
+      <w:pPr>
+        <w:pStyle w:val="ListBullet"/>
+      </w:pPr>
+      <w:r>
         <w:t>**Prior UX commit:** `962b219` (Close Shop UI)</w:t>
       </w:r>
     </w:p>
@@ -760,7 +1105,7 @@
         <w:pStyle w:val="ListBullet"/>
       </w:pPr>
       <w:r>
-        <w:t>**Preview:** Vercel Preview from branch push (unchanged merge policy)</w:t>
+        <w:t>**Preview build:** Vercel Ready; automated agent blocked by SSO</w:t>
       </w:r>
     </w:p>
     <w:p>

</xml_diff>